<commit_message>
Modification pluriel singulier liste PC. Modification capture ecran tx chgt. Correction remplacement tag fermeture
</commit_message>
<xml_diff>
--- a/src/main/resources/templates/modele.docx
+++ b/src/main/resources/templates/modele.docx
@@ -710,11 +710,6 @@
             </w:r>
           </w:p>
           <w:p>
-            <w:pPr>
-              <w:rPr>
-                <w:lang w:val="de-DE"/>
-              </w:rPr>
-            </w:pPr>
             <w:r>
               <w:t xml:space="preserve">Je vous informe que le produit concernant le </w:t>
             </w:r>
@@ -773,38 +768,13 @@
             </w:r>
           </w:p>
           <w:p>
-            <w:r>
-              <w:t>Le</w:t>
-            </w:r>
-            <w:r>
-              <w:t>s</w:t>
-            </w:r>
-            <w:r>
-              <w:t xml:space="preserve"> PC</w:t>
-            </w:r>
-            <w:r>
-              <w:t xml:space="preserve"> {{RISQUE}} </w:t>
-            </w:r>
-            <w:r>
-              <w:t>suivant ont</w:t>
-            </w:r>
-            <w:r>
-              <w:t xml:space="preserve"> été</w:t>
-            </w:r>
-            <w:r>
-              <w:t xml:space="preserve"> </w:t>
-            </w:r>
-            <w:r>
-              <w:t>{{ACTION}}</w:t>
-            </w:r>
-            <w:r>
-              <w:t xml:space="preserve"> </w:t>
-            </w:r>
-            <w:r>
-              <w:t>:</w:t>
-            </w:r>
-            <w:r>
-              <w:t xml:space="preserve"> </w:t>
+            <w:pPr>
+              <w:rPr>
+                <w:lang w:val="de-DE"/>
+              </w:rPr>
+            </w:pPr>
+            <w:r>
+              <w:t>{{LISTE_PCS}}</w:t>
             </w:r>
           </w:p>
           <w:p>
@@ -899,6 +869,11 @@
           <w:p>
             <w:r>
               <w:t>{{EQUIPE_PRESTATION}}</w:t>
+            </w:r>
+          </w:p>
+          <w:p>
+            <w:r>
+              <w:t>{{FERMETURE_PC}}</w:t>
             </w:r>
           </w:p>
           <w:p>
@@ -2418,6 +2393,7 @@
     <w:rsid w:val="00330ADA"/>
     <w:rsid w:val="00335C9C"/>
     <w:rsid w:val="003B6F97"/>
+    <w:rsid w:val="003D4273"/>
     <w:rsid w:val="00425B0F"/>
     <w:rsid w:val="004569AD"/>
     <w:rsid w:val="004707CA"/>
@@ -2435,6 +2411,7 @@
     <w:rsid w:val="00656C66"/>
     <w:rsid w:val="006C4145"/>
     <w:rsid w:val="006D0DAF"/>
+    <w:rsid w:val="00745F40"/>
     <w:rsid w:val="00762953"/>
     <w:rsid w:val="0080352F"/>
     <w:rsid w:val="0089396B"/>
@@ -2452,19 +2429,23 @@
     <w:rsid w:val="00C02D9B"/>
     <w:rsid w:val="00C567CF"/>
     <w:rsid w:val="00CD6E15"/>
+    <w:rsid w:val="00CF17A3"/>
     <w:rsid w:val="00D3283F"/>
     <w:rsid w:val="00D55B25"/>
     <w:rsid w:val="00D579F0"/>
     <w:rsid w:val="00D718E3"/>
+    <w:rsid w:val="00D729D8"/>
     <w:rsid w:val="00D84D18"/>
     <w:rsid w:val="00D9336D"/>
     <w:rsid w:val="00DB3705"/>
     <w:rsid w:val="00DB4666"/>
+    <w:rsid w:val="00DD4FCB"/>
     <w:rsid w:val="00DF2231"/>
     <w:rsid w:val="00E41D12"/>
     <w:rsid w:val="00EA18F8"/>
     <w:rsid w:val="00EC18B4"/>
     <w:rsid w:val="00ED1EBC"/>
+    <w:rsid w:val="00EE7466"/>
     <w:rsid w:val="00F231BF"/>
     <w:rsid w:val="00F27320"/>
     <w:rsid w:val="00F36885"/>
@@ -3245,10 +3226,6 @@
 </file>
 
 <file path=customXml/item2.xml><?xml version="1.0" encoding="utf-8"?>
-<b:Sources xmlns:b="http://schemas.openxmlformats.org/officeDocument/2006/bibliography" xmlns="http://schemas.openxmlformats.org/officeDocument/2006/bibliography" SelectedStyle="\APASixthEditionOfficeOnline.xsl" StyleName="APA" Version="6"/>
-</file>
-
-<file path=customXml/item3.xml><?xml version="1.0" encoding="utf-8"?>
 <root>
   <NumFormulaire/>
   <RaisonSociale/>
@@ -3262,6 +3239,10 @@
 </root>
 </file>
 
+<file path=customXml/item3.xml><?xml version="1.0" encoding="utf-8"?>
+<b:Sources xmlns:b="http://schemas.openxmlformats.org/officeDocument/2006/bibliography" xmlns="http://schemas.openxmlformats.org/officeDocument/2006/bibliography" SelectedStyle="\APASixthEditionOfficeOnline.xsl" StyleName="APA" Version="6"/>
+</file>
+
 <file path=customXml/itemProps1.xml><?xml version="1.0" encoding="utf-8"?>
 <ds:datastoreItem xmlns:ds="http://schemas.openxmlformats.org/officeDocument/2006/customXml" ds:itemID="{55AF091B-3C7A-41E3-B477-F2FDAA23CFDA}">
   <ds:schemaRefs>
@@ -3271,15 +3252,15 @@
 </file>
 
 <file path=customXml/itemProps2.xml><?xml version="1.0" encoding="utf-8"?>
+<ds:datastoreItem xmlns:ds="http://schemas.openxmlformats.org/officeDocument/2006/customXml" ds:itemID="{A1561212-7F59-4B67-AAF9-F3FAAD3CBC3D}">
+  <ds:schemaRefs/>
+</ds:datastoreItem>
+</file>
+
+<file path=customXml/itemProps3.xml><?xml version="1.0" encoding="utf-8"?>
 <ds:datastoreItem xmlns:ds="http://schemas.openxmlformats.org/officeDocument/2006/customXml" ds:itemID="{B903EAB8-5D1D-4678-9C1E-DEE11429FF16}">
   <ds:schemaRefs>
     <ds:schemaRef ds:uri="http://schemas.openxmlformats.org/officeDocument/2006/bibliography"/>
   </ds:schemaRefs>
 </ds:datastoreItem>
-</file>
-
-<file path=customXml/itemProps3.xml><?xml version="1.0" encoding="utf-8"?>
-<ds:datastoreItem xmlns:ds="http://schemas.openxmlformats.org/officeDocument/2006/customXml" ds:itemID="{A1561212-7F59-4B67-AAF9-F3FAAD3CBC3D}">
-  <ds:schemaRefs/>
-</ds:datastoreItem>
 </file>
</xml_diff>